<commit_message>
feat: add ER diagram generator for E-Commerce Analytics Platform
- Implemented a Python script to generate a high-resolution ER diagram.
- Utilized matplotlib for drawing PostgreSQL tables and MongoDB collections.
- Defined table structures and relationships for both databases.
- Included visual elements such as headers, arrows, and legends for clarity.
- Configured output path and diagram aesthetics for better presentation.
</commit_message>
<xml_diff>
--- a/docs/G11_Final_Report.docx
+++ b/docs/G11_Final_Report.docx
@@ -734,6 +734,90 @@
         <w:t>3. Relational Database (PostgreSQL)</w:t>
       </w:r>
     </w:p>
+    <w:p>
+      <w:pPr>
+        <w:pStyle w:val="Heading2"/>
+        <w:spacing w:before="240" w:after="120"/>
+      </w:pPr>
+      <w:r>
+        <w:rPr>
+          <w:color w:val="1976D2"/>
+          <w:sz w:val="28"/>
+        </w:rPr>
+        <w:t>3.0 Entity-Relationship Diagram</w:t>
+      </w:r>
+    </w:p>
+    <w:p>
+      <w:pPr>
+        <w:jc w:val="center"/>
+      </w:pPr>
+      <w:r>
+        <w:drawing>
+          <wp:inline xmlns:a="http://schemas.openxmlformats.org/drawingml/2006/main" xmlns:pic="http://schemas.openxmlformats.org/drawingml/2006/picture">
+            <wp:extent cx="5760720" cy="3260697"/>
+            <wp:docPr id="1" name="Picture 1"/>
+            <wp:cNvGraphicFramePr>
+              <a:graphicFrameLocks noChangeAspect="1"/>
+            </wp:cNvGraphicFramePr>
+            <a:graphic>
+              <a:graphicData uri="http://schemas.openxmlformats.org/drawingml/2006/picture">
+                <pic:pic>
+                  <pic:nvPicPr>
+                    <pic:cNvPr id="0" name="ER_Diagram.png"/>
+                    <pic:cNvPicPr/>
+                  </pic:nvPicPr>
+                  <pic:blipFill>
+                    <a:blip r:embed="rId9"/>
+                    <a:stretch>
+                      <a:fillRect/>
+                    </a:stretch>
+                  </pic:blipFill>
+                  <pic:spPr>
+                    <a:xfrm>
+                      <a:off x="0" y="0"/>
+                      <a:ext cx="5760720" cy="3260697"/>
+                    </a:xfrm>
+                    <a:prstGeom prst="rect"/>
+                  </pic:spPr>
+                </pic:pic>
+              </a:graphicData>
+            </a:graphic>
+          </wp:inline>
+        </w:drawing>
+      </w:r>
+    </w:p>
+    <w:p>
+      <w:pPr>
+        <w:jc w:val="center"/>
+      </w:pPr>
+      <w:r>
+        <w:rPr>
+          <w:i/>
+          <w:color w:val="757575"/>
+          <w:sz w:val="16"/>
+        </w:rPr>
+        <w:t>Figure 1: Complete Entity-Relationship Diagram showing all 8 PostgreSQL tables (left), 4 MongoDB collections (right), relationships (solid blue arrows), database triggers (dashed orange arrows), and the CDC sync flow via the Outbox Pattern (purple arrow).</w:t>
+      </w:r>
+    </w:p>
+    <w:p>
+      <w:pPr/>
+      <w:r>
+        <w:rPr>
+          <w:sz w:val="20"/>
+        </w:rPr>
+        <w:t>Diagram Explanation: The ER diagram above illustrates the complete dual-database architecture. On the left side (blue), 8 PostgreSQL tables model the transactional core: users stores authentication credentials with bcrypt-hashed passwords, customers holds customer profiles with UUID primary keys, products maintains the catalog with CHECK constraints on stock quantities, orders records each purchase linked to a customer, and order_items captures individual line items with foreign keys to both orders and products. The outbox table serves as a CDC event store, order_audit_log tracks every field-level change, and alerts records fraud detection results.</w:t>
+      </w:r>
+    </w:p>
+    <w:p>
+      <w:pPr/>
+      <w:r>
+        <w:rPr>
+          <w:sz w:val="20"/>
+        </w:rPr>
+        <w:t>On the right side (green), 4 MongoDB collections implement established NoSQL patterns: user_sessions uses the Bucket Pattern to accumulate clickstream events via atomic $push + $inc operations, session_stats provides pre-computed session aggregates (Computed Pattern), customer_order_summary holds denormalized order data synced via CDC (CDC Target Pattern), and funnel_metrics caches conversion funnel results (Cached Pattern). Relationships are shown as solid blue arrows, triggers as dashed orange arrows, and the CDC sync flow as a purple arrow.</w:t>
+      </w:r>
+    </w:p>
+    <w:p/>
     <w:p>
       <w:pPr>
         <w:pStyle w:val="Heading2"/>

</xml_diff>

<commit_message>
update docs and dataloader cause its too slow
</commit_message>
<xml_diff>
--- a/docs/G11_Final_Report.docx
+++ b/docs/G11_Final_Report.docx
@@ -749,12 +749,25 @@
     </w:p>
     <w:p>
       <w:pPr>
+        <w:spacing w:after="80"/>
+      </w:pPr>
+      <w:r>
+        <w:rPr>
+          <w:b/>
+          <w:color w:val="1976D2"/>
+          <w:sz w:val="22"/>
+        </w:rPr>
+        <w:t>Part 1: PostgreSQL — Relational Database (8 Tables, 4 Triggers)</w:t>
+      </w:r>
+    </w:p>
+    <w:p>
+      <w:pPr>
         <w:jc w:val="center"/>
       </w:pPr>
       <w:r>
         <w:drawing>
           <wp:inline xmlns:a="http://schemas.openxmlformats.org/drawingml/2006/main" xmlns:pic="http://schemas.openxmlformats.org/drawingml/2006/picture">
-            <wp:extent cx="5760720" cy="3260697"/>
+            <wp:extent cx="5760720" cy="4470156"/>
             <wp:docPr id="1" name="Picture 1"/>
             <wp:cNvGraphicFramePr>
               <a:graphicFrameLocks noChangeAspect="1"/>
@@ -763,7 +776,7 @@
               <a:graphicData uri="http://schemas.openxmlformats.org/drawingml/2006/picture">
                 <pic:pic>
                   <pic:nvPicPr>
-                    <pic:cNvPr id="0" name="ER_Diagram.png"/>
+                    <pic:cNvPr id="0" name="ER_Diagram_PostgreSQL.png"/>
                     <pic:cNvPicPr/>
                   </pic:nvPicPr>
                   <pic:blipFill>
@@ -775,7 +788,7 @@
                   <pic:spPr>
                     <a:xfrm>
                       <a:off x="0" y="0"/>
-                      <a:ext cx="5760720" cy="3260697"/>
+                      <a:ext cx="5760720" cy="4470156"/>
                     </a:xfrm>
                     <a:prstGeom prst="rect"/>
                   </pic:spPr>
@@ -796,7 +809,83 @@
           <w:color w:val="757575"/>
           <w:sz w:val="16"/>
         </w:rPr>
-        <w:t>Figure 1: Complete Entity-Relationship Diagram showing all 8 PostgreSQL tables (left), 4 MongoDB collections (right), relationships (solid blue arrows), database triggers (dashed orange arrows), and the CDC sync flow via the Outbox Pattern (purple arrow).</w:t>
+        <w:t>Figure 1a: PostgreSQL ER Diagram — 8 tables with FK relationships (solid blue arrows), 4 database triggers (dashed orange arrows), and fraud detection link (dotted gray). The trigger info box details all 4 automatic database rules: stock check, inventory deduction, outbox CDC event generation, and audit logging.</w:t>
+      </w:r>
+    </w:p>
+    <w:p/>
+    <w:p>
+      <w:pPr>
+        <w:spacing w:after="80"/>
+      </w:pPr>
+      <w:r>
+        <w:rPr>
+          <w:b/>
+          <w:color w:val="0D47A1"/>
+          <w:sz w:val="22"/>
+        </w:rPr>
+        <w:t>Part 2: MongoDB — NoSQL Document Store (4 Collections, 4 Patterns)</w:t>
+      </w:r>
+    </w:p>
+    <w:p>
+      <w:pPr>
+        <w:jc w:val="center"/>
+      </w:pPr>
+      <w:r>
+        <w:drawing>
+          <wp:inline xmlns:a="http://schemas.openxmlformats.org/drawingml/2006/main" xmlns:pic="http://schemas.openxmlformats.org/drawingml/2006/picture">
+            <wp:extent cx="5760720" cy="3843194"/>
+            <wp:docPr id="2" name="Picture 2"/>
+            <wp:cNvGraphicFramePr>
+              <a:graphicFrameLocks noChangeAspect="1"/>
+            </wp:cNvGraphicFramePr>
+            <a:graphic>
+              <a:graphicData uri="http://schemas.openxmlformats.org/drawingml/2006/picture">
+                <pic:pic>
+                  <pic:nvPicPr>
+                    <pic:cNvPr id="0" name="ER_Diagram_MongoDB.png"/>
+                    <pic:cNvPicPr/>
+                  </pic:nvPicPr>
+                  <pic:blipFill>
+                    <a:blip r:embed="rId10"/>
+                    <a:stretch>
+                      <a:fillRect/>
+                    </a:stretch>
+                  </pic:blipFill>
+                  <pic:spPr>
+                    <a:xfrm>
+                      <a:off x="0" y="0"/>
+                      <a:ext cx="5760720" cy="3843194"/>
+                    </a:xfrm>
+                    <a:prstGeom prst="rect"/>
+                  </pic:spPr>
+                </pic:pic>
+              </a:graphicData>
+            </a:graphic>
+          </wp:inline>
+        </w:drawing>
+      </w:r>
+    </w:p>
+    <w:p>
+      <w:pPr>
+        <w:jc w:val="center"/>
+      </w:pPr>
+      <w:r>
+        <w:rPr>
+          <w:i/>
+          <w:color w:val="757575"/>
+          <w:sz w:val="16"/>
+        </w:rPr>
+        <w:t>Figure 1b: MongoDB Collections — 4 collections implementing established NoSQL design patterns: Bucket Pattern (user_sessions), Computed Pattern (session_stats), CDC Target Pattern (customer_order_summary), and Cached Pattern (funnel_metrics). The CDC sync box explains the Outbox Pattern flow from PostgreSQL to MongoDB. The operations box lists all MongoDB operations and indexes used.</w:t>
+      </w:r>
+    </w:p>
+    <w:p/>
+    <w:p>
+      <w:pPr/>
+      <w:r>
+        <w:rPr>
+          <w:sz w:val="20"/>
+        </w:rPr>
+        <w:t>Diagram Explanation: The ER diagrams above illustrate the complete dual-database architecture split across two pages for readability. In Figure 1a (PostgreSQL), 8 tables model the transactional core: users stores authentication credentials with bcrypt-hashed passwords, customers holds customer profiles with UUID primary keys, products maintains the catalog with CHECK constraints on stock quantities, orders records each purchase linked to a customer, and order_items captures individual line items with foreign keys to both orders and products. The outbox table serves as a CDC event store, order_audit_log tracks every field-level change, and alerts records fraud detection results.</w:t>
       </w:r>
     </w:p>
     <w:p>
@@ -805,16 +894,7 @@
         <w:rPr>
           <w:sz w:val="20"/>
         </w:rPr>
-        <w:t>Diagram Explanation: The ER diagram above illustrates the complete dual-database architecture. On the left side (blue), 8 PostgreSQL tables model the transactional core: users stores authentication credentials with bcrypt-hashed passwords, customers holds customer profiles with UUID primary keys, products maintains the catalog with CHECK constraints on stock quantities, orders records each purchase linked to a customer, and order_items captures individual line items with foreign keys to both orders and products. The outbox table serves as a CDC event store, order_audit_log tracks every field-level change, and alerts records fraud detection results.</w:t>
-      </w:r>
-    </w:p>
-    <w:p>
-      <w:pPr/>
-      <w:r>
-        <w:rPr>
-          <w:sz w:val="20"/>
-        </w:rPr>
-        <w:t>On the right side (green), 4 MongoDB collections implement established NoSQL patterns: user_sessions uses the Bucket Pattern to accumulate clickstream events via atomic $push + $inc operations, session_stats provides pre-computed session aggregates (Computed Pattern), customer_order_summary holds denormalized order data synced via CDC (CDC Target Pattern), and funnel_metrics caches conversion funnel results (Cached Pattern). Relationships are shown as solid blue arrows, triggers as dashed orange arrows, and the CDC sync flow as a purple arrow.</w:t>
+        <w:t>In Figure 1b (MongoDB), 4 collections implement established NoSQL patterns: user_sessions uses the Bucket Pattern to accumulate clickstream events via atomic $push + $inc operations, session_stats provides pre-computed session aggregates (Computed Pattern), customer_order_summary holds denormalized order data synced via CDC (CDC Target Pattern), and funnel_metrics caches conversion funnel results (Cached Pattern). The CDC sync box details the 4-step Outbox Pattern flow from PostgreSQL trigger to MongoDB atomic update every 5 seconds.</w:t>
       </w:r>
     </w:p>
     <w:p/>

</xml_diff>

<commit_message>
feat: enhance data loader performance and update documentation for clarity
</commit_message>
<xml_diff>
--- a/docs/G11_Final_Report.docx
+++ b/docs/G11_Final_Report.docx
@@ -1133,7 +1133,7 @@
                 <w:color w:val="333333"/>
                 <w:sz w:val="18"/>
               </w:rPr>
-              <w:t>VARCHAR PK, 7 categories, unit_price, stock_quantity (CHECK &gt;= 0). 1,197 items.</w:t>
+              <w:t>VARCHAR PK, name, 7 categories, unit_price, stock_quantity (CHECK &gt;= 0). 1,197 items.</w:t>
             </w:r>
           </w:p>
         </w:tc>
@@ -1183,7 +1183,7 @@
                 <w:color w:val="333333"/>
                 <w:sz w:val="18"/>
               </w:rPr>
-              <w:t>UUID PK, FK → customers, order_date, total_amount, status. ~53,000 rows.</w:t>
+              <w:t>UUID PK, FK → customers, order_date, total_amount, status. ~33,580 rows (full) / 3,000 (demo).</w:t>
             </w:r>
           </w:p>
         </w:tc>
@@ -2446,7 +2446,7 @@
           <w:color w:val="333333"/>
           <w:sz w:val="20"/>
         </w:rPr>
-        <w:t>JWT authentication with bcrypt password hashing and role-based access control (customer/admin)</w:t>
+        <w:t>JWT authentication with bcrypt password hashing and role-based access control (customer/admin). The first user (user_1) is auto-assigned admin role for instant dashboard access.</w:t>
       </w:r>
     </w:p>
     <w:p>
@@ -2458,7 +2458,7 @@
           <w:color w:val="333333"/>
           <w:sz w:val="20"/>
         </w:rPr>
-        <w:t>Product catalog with category filter (7 categories), text search, and pagination (20/100 per page)</w:t>
+        <w:t>Product catalog with category filter (7 categories), text search, product names, and pagination (20/100 per page)</w:t>
       </w:r>
     </w:p>
     <w:p>
@@ -2470,7 +2470,7 @@
           <w:color w:val="333333"/>
           <w:sz w:val="20"/>
         </w:rPr>
-        <w:t>Clickstream event tracking via MongoDB Bucket Pattern — all 4 funnel event types recorded with $push + $inc</w:t>
+        <w:t>Clickstream event tracking via MongoDB Bucket Pattern — all 4 funnel event types recorded. Bulk data loading uses batch $push: { $each: [...] } (one DB call per session); runtime uses individual $push + $inc (O(1) per event)</w:t>
       </w:r>
     </w:p>
     <w:p>
@@ -2506,7 +2506,7 @@
           <w:color w:val="333333"/>
           <w:sz w:val="20"/>
         </w:rPr>
-        <w:t>Admin dashboard with RFM pie chart (Champions/Loyal/At Risk/Lost), funnel bar chart (4-stage conversion), market basket table (top 10 pairs), top products, sales by category, and fraud alerts table</w:t>
+        <w:t>Admin dashboard with RFM pie chart, funnel bar chart (4-stage conversion), market basket (top 10 pairs with product names), top products, sales by category, and fraud alerts</w:t>
       </w:r>
     </w:p>
     <w:p>
@@ -2518,7 +2518,19 @@
           <w:color w:val="333333"/>
           <w:sz w:val="20"/>
         </w:rPr>
-        <w:t>Automated test suite — 161 tests covering every endpoint, trigger, and error case (7-second runtime, 100% pass rate)</w:t>
+        <w:t>Optimized data loader: ~50s demo mode (24x speedup via batch MongoDB writes, nrows sampling, shared bcrypt hash). Controlled via DEMO_MODE env var in .env file. Full 275K-row dataset via DEMO_MODE=false</w:t>
+      </w:r>
+    </w:p>
+    <w:p>
+      <w:pPr>
+        <w:pStyle w:val="ListBullet"/>
+      </w:pPr>
+      <w:r>
+        <w:rPr>
+          <w:color w:val="333333"/>
+          <w:sz w:val="20"/>
+        </w:rPr>
+        <w:t>Automated test suite — 161 tests covering every endpoint, trigger, and error case (3-7 second runtime, 100% pass)</w:t>
       </w:r>
     </w:p>
     <w:p>
@@ -3716,7 +3728,7 @@
           <w:color w:val="333333"/>
           <w:sz w:val="20"/>
         </w:rPr>
-        <w:t>perfectly matched the clickstream use case. $push + $inc operations are O(1) and avoid the document-per-event anti-pattern.</w:t>
+        <w:t>perfectly matched the clickstream use case. Bulk loading uses $push: { $each: [...] } (one DB call per session); runtime $push + $inc operations are O(1) and avoid the document-per-event anti-pattern.</w:t>
       </w:r>
     </w:p>
     <w:p>
@@ -4254,7 +4266,7 @@
                 <w:color w:val="333333"/>
                 <w:sz w:val="18"/>
               </w:rPr>
-              <w:t>CSV ingestion pipeline for 6 datasets into both databases</w:t>
+              <w:t>CSV ingestion pipeline (batch-optimized: ~50s demo, ~20 min full). DEMO_MODE env var, nrows sampling, bulk MongoDB writes.</w:t>
             </w:r>
           </w:p>
         </w:tc>

</xml_diff>